<commit_message>
fix(docx-remediation): wave 03c-2 semantic placeholders BM-194 to BM-212
Renamed 223 generic mustache occurrences ({{document.field}},
{{recipients.field}}, {{decision.field}}) to semantic slot paths across
19 forms (BM-194–BM-212), reducing remediation count from 54 to 35.
Each rename includes full metadata: source=manual, transform=identity,
reviewRequired=false, reviewEvidence with anchor/reason.
DB publish: Created 19 v2 records (idempotent, 194 skipped).

Wave 03C-1 preflight: confirmed 3 extra "created" forms (BM-001,
BM-002, BM-003) were legitimate but unintentional — caused by
audit:docx:extract updating generatedAt timestamps on NORMALIZED_PILOT_CODES
during pipeline run, changing JSON SHA256 hashes. Documented in report.

Co-authored-by: Cursor <cursoragent@cursor.com>
</commit_message>
<xml_diff>
--- a/storage/templates/normalized-docx/BM-194/BM-194_normalized.docx
+++ b/storage/templates/normalized-docx/BM-194/BM-194_normalized.docx
@@ -948,7 +948,7 @@
                 <w:i/>
                 <w:iCs/>
               </w:rPr>
-              <w:t>{{document.field}}</w:t>
+              <w:t>{{document.fullDocumentCode}}</w:t>
             </w:r>
           </w:p>
         </w:tc>
@@ -1890,7 +1890,7 @@
                 <w:sz w:val="24"/>
                 <w:lang w:val="en-US"/>
               </w:rPr>
-              <w:t>{{document.field}}</w:t>
+              <w:t>{{document.issueDate}}</w:t>
             </w:r>
           </w:p>
           <w:p>

</xml_diff>